<commit_message>
sửa lại phần tìm luật kết hợp
</commit_message>
<xml_diff>
--- a/Ôn thi/2-Sinh luật kết hợp/1.1-Sinh tập phổ biến bằng Apriori/1.1-Mã giả Sinh tập phổ biến bằng Apriori.docx
+++ b/Ôn thi/2-Sinh luật kết hợp/1.1-Sinh tập phổ biến bằng Apriori/1.1-Mã giả Sinh tập phổ biến bằng Apriori.docx
@@ -75,10 +75,7 @@
     <w:p/>
     <w:p>
       <w:r>
-        <w:t>Item tạo mới bằng phép hợp</w:t>
-      </w:r>
-      <w:r>
-        <w:t xml:space="preserve"> (union)</w:t>
+        <w:t>Item tạo mới bằng phép hợp (union)</w:t>
       </w:r>
     </w:p>
     <w:p>
@@ -95,78 +92,563 @@
       </w:r>
     </w:p>
     <w:p/>
+    <w:tbl>
+      <w:tblPr>
+        <w:tblStyle w:val="LiBang"/>
+        <w:tblW w:w="0" w:type="auto"/>
+        <w:tblLook w:val="04A0" w:firstRow="1" w:lastRow="0" w:firstColumn="1" w:lastColumn="0" w:noHBand="0" w:noVBand="1"/>
+      </w:tblPr>
+      <w:tblGrid>
+        <w:gridCol w:w="2425"/>
+        <w:gridCol w:w="6925"/>
+      </w:tblGrid>
+      <w:tr>
+        <w:tc>
+          <w:tcPr>
+            <w:tcW w:w="2425" w:type="dxa"/>
+          </w:tcPr>
+          <w:p>
+            <w:r>
+              <w:t xml:space="preserve">(GPT) </w:t>
+            </w:r>
+          </w:p>
+          <w:p/>
+        </w:tc>
+        <w:tc>
+          <w:tcPr>
+            <w:tcW w:w="6925" w:type="dxa"/>
+          </w:tcPr>
+          <w:p>
+            <w:pPr>
+              <w:spacing w:after="160" w:line="278" w:lineRule="auto"/>
+              <w:rPr>
+                <w:lang w:val="vi-VN"/>
+              </w:rPr>
+            </w:pPr>
+            <w:r>
+              <w:rPr>
+                <w:lang w:val="vi-VN"/>
+              </w:rPr>
+              <w:t>Quy tắc Apriori-gen:</w:t>
+            </w:r>
+          </w:p>
+          <w:p>
+            <w:pPr>
+              <w:spacing w:after="160" w:line="278" w:lineRule="auto"/>
+              <w:rPr>
+                <w:lang w:val="vi-VN"/>
+              </w:rPr>
+            </w:pPr>
+            <w:r>
+              <w:rPr>
+                <w:lang w:val="vi-VN"/>
+              </w:rPr>
+              <w:t>Muốn sinh tập k phần tử:</w:t>
+            </w:r>
+          </w:p>
+          <w:p>
+            <w:pPr>
+              <w:numPr>
+                <w:ilvl w:val="0"/>
+                <w:numId w:val="22"/>
+              </w:numPr>
+              <w:spacing w:after="160" w:line="278" w:lineRule="auto"/>
+              <w:rPr>
+                <w:lang w:val="vi-VN"/>
+              </w:rPr>
+            </w:pPr>
+            <w:r>
+              <w:rPr>
+                <w:lang w:val="vi-VN"/>
+              </w:rPr>
+              <w:t xml:space="preserve">chỉ ghép 2 tập k-1 phần tử </w:t>
+            </w:r>
+          </w:p>
+          <w:p>
+            <w:pPr>
+              <w:numPr>
+                <w:ilvl w:val="0"/>
+                <w:numId w:val="22"/>
+              </w:numPr>
+              <w:spacing w:after="160" w:line="278" w:lineRule="auto"/>
+              <w:rPr>
+                <w:lang w:val="vi-VN"/>
+              </w:rPr>
+            </w:pPr>
+            <w:r>
+              <w:rPr>
+                <w:lang w:val="vi-VN"/>
+              </w:rPr>
+              <w:t>nếu chúng giống nhau ở k-2 phần tử đầu</w:t>
+            </w:r>
+          </w:p>
+        </w:tc>
+      </w:tr>
+    </w:tbl>
+    <w:p/>
+    <w:p/>
     <w:p>
-      <w:r>
-        <w:t>Sinh các tập hợp 1 phần tử</w:t>
-      </w:r>
-      <w:r>
-        <w:t xml:space="preserve"> = setA1</w:t>
+      <w:pPr>
+        <w:jc w:val="left"/>
+      </w:pPr>
+      <w:r>
+        <w:br w:type="page"/>
       </w:r>
     </w:p>
     <w:p>
       <w:r>
-        <w:t>Loại các A1 không thỏa mãn minSupport</w:t>
+        <w:lastRenderedPageBreak/>
+        <w:t xml:space="preserve">Không </w:t>
+      </w:r>
+      <w:r>
+        <w:t>d</w:t>
+      </w:r>
+      <w:r>
+        <w:t xml:space="preserve">ùng Apriori gen, </w:t>
+      </w:r>
+      <w:r>
+        <w:t xml:space="preserve">Tạo </w:t>
+      </w:r>
+      <w:r>
+        <w:t>các tập hợp 1 phần tử = setA</w:t>
+      </w:r>
+      <w:r>
+        <w:t>[</w:t>
+      </w:r>
+      <w:r>
+        <w:t>1</w:t>
+      </w:r>
+      <w:r>
+        <w:t>]</w:t>
+      </w:r>
+      <w:r>
+        <w:t xml:space="preserve"> </w:t>
+      </w:r>
+    </w:p>
+    <w:p>
+      <w:r>
+        <w:t xml:space="preserve">Loại các </w:t>
+      </w:r>
+      <w:r>
+        <w:t>setA[1][i]</w:t>
+      </w:r>
+      <w:r>
+        <w:t xml:space="preserve"> không thỏa mãn minSupport</w:t>
       </w:r>
     </w:p>
     <w:p/>
     <w:p>
-      <w:r>
-        <w:t>Sinh các tập hợp 2 phần tử = setA2 từ các setA1 đã loại bỏ</w:t>
+      <w:pPr>
+        <w:jc w:val="left"/>
+      </w:pPr>
+      <w:r>
+        <w:br w:type="page"/>
       </w:r>
     </w:p>
     <w:p>
       <w:r>
-        <w:t>(Sinh bằng cách hợp các phần tử)</w:t>
+        <w:lastRenderedPageBreak/>
+        <w:t xml:space="preserve">Dùng Apriori gen, </w:t>
+      </w:r>
+      <w:r>
+        <w:t>Sinh các tập hợp 2 phần tử = setA</w:t>
+      </w:r>
+      <w:r>
+        <w:t>[</w:t>
+      </w:r>
+      <w:r>
+        <w:t>2</w:t>
+      </w:r>
+      <w:r>
+        <w:t>]</w:t>
+      </w:r>
+      <w:r>
+        <w:t xml:space="preserve"> từ setA</w:t>
+      </w:r>
+      <w:r>
+        <w:t>[</w:t>
+      </w:r>
+      <w:r>
+        <w:t>1</w:t>
+      </w:r>
+      <w:r>
+        <w:t>]</w:t>
+      </w:r>
+      <w:r>
+        <w:t xml:space="preserve"> đã loại bỏ</w:t>
       </w:r>
     </w:p>
     <w:p>
       <w:r>
-        <w:t>Loại các A2 không thỏa mãn minSupport</w:t>
+        <w:t xml:space="preserve">(Sinh bằng cách </w:t>
+      </w:r>
+    </w:p>
+    <w:p>
+      <w:pPr>
+        <w:pStyle w:val="oancuaDanhsach"/>
+        <w:numPr>
+          <w:ilvl w:val="0"/>
+          <w:numId w:val="21"/>
+        </w:numPr>
+      </w:pPr>
+      <w:r>
+        <w:t xml:space="preserve">Chọn các phần tử </w:t>
+      </w:r>
+      <w:r>
+        <w:t xml:space="preserve">1 phần tử </w:t>
+      </w:r>
+      <w:r>
+        <w:t xml:space="preserve">có chung </w:t>
+      </w:r>
+      <w:r>
+        <w:t>0</w:t>
+      </w:r>
+      <w:r>
+        <w:t xml:space="preserve"> phần tử</w:t>
+      </w:r>
+    </w:p>
+    <w:p>
+      <w:pPr>
+        <w:pStyle w:val="oancuaDanhsach"/>
+        <w:numPr>
+          <w:ilvl w:val="0"/>
+          <w:numId w:val="21"/>
+        </w:numPr>
+      </w:pPr>
+      <w:r>
+        <w:t>hợp các phần tử)</w:t>
+      </w:r>
+    </w:p>
+    <w:p>
+      <w:r>
+        <w:t xml:space="preserve">Loại các </w:t>
+      </w:r>
+      <w:r>
+        <w:t>set</w:t>
+      </w:r>
+      <w:r>
+        <w:t>A</w:t>
+      </w:r>
+      <w:r>
+        <w:t>[</w:t>
+      </w:r>
+      <w:r>
+        <w:t>2</w:t>
+      </w:r>
+      <w:r>
+        <w:t>][i]</w:t>
+      </w:r>
+      <w:r>
+        <w:t xml:space="preserve"> không thỏa mãn minSupport</w:t>
       </w:r>
     </w:p>
     <w:p/>
     <w:p>
-      <w:r>
-        <w:t>…</w:t>
+      <w:pPr>
+        <w:jc w:val="left"/>
+      </w:pPr>
+      <w:r>
+        <w:br w:type="page"/>
+      </w:r>
+    </w:p>
+    <w:p>
+      <w:r>
+        <w:lastRenderedPageBreak/>
+        <w:t xml:space="preserve">Dùng Apriori gen, </w:t>
+      </w:r>
+      <w:r>
+        <w:t xml:space="preserve">Sinh các tập hợp </w:t>
+      </w:r>
+      <w:r>
+        <w:t>3</w:t>
+      </w:r>
+      <w:r>
+        <w:t xml:space="preserve"> phần tử = setA</w:t>
+      </w:r>
+      <w:r>
+        <w:t>[</w:t>
+      </w:r>
+      <w:r>
+        <w:t>3</w:t>
+      </w:r>
+      <w:r>
+        <w:t>]</w:t>
+      </w:r>
+      <w:r>
+        <w:t xml:space="preserve"> từ setA</w:t>
+      </w:r>
+      <w:r>
+        <w:t>[</w:t>
+      </w:r>
+      <w:r>
+        <w:t>2</w:t>
+      </w:r>
+      <w:r>
+        <w:t>]</w:t>
+      </w:r>
+      <w:r>
+        <w:t xml:space="preserve"> đã loại bỏ</w:t>
+      </w:r>
+    </w:p>
+    <w:p>
+      <w:r>
+        <w:t xml:space="preserve">(Sinh bằng cách </w:t>
+      </w:r>
+    </w:p>
+    <w:p>
+      <w:pPr>
+        <w:pStyle w:val="oancuaDanhsach"/>
+        <w:numPr>
+          <w:ilvl w:val="0"/>
+          <w:numId w:val="21"/>
+        </w:numPr>
+      </w:pPr>
+      <w:r>
+        <w:t xml:space="preserve">Chọn các phần tử </w:t>
+      </w:r>
+      <w:r>
+        <w:t>2</w:t>
+      </w:r>
+      <w:r>
+        <w:t xml:space="preserve"> phần tử có chung </w:t>
+      </w:r>
+      <w:r>
+        <w:t>1</w:t>
+      </w:r>
+      <w:r>
+        <w:t xml:space="preserve"> phần tử</w:t>
+      </w:r>
+    </w:p>
+    <w:p>
+      <w:pPr>
+        <w:pStyle w:val="oancuaDanhsach"/>
+        <w:numPr>
+          <w:ilvl w:val="0"/>
+          <w:numId w:val="21"/>
+        </w:numPr>
+      </w:pPr>
+      <w:r>
+        <w:t>hợp các phần tử)</w:t>
+      </w:r>
+    </w:p>
+    <w:p>
+      <w:r>
+        <w:t xml:space="preserve">Loại các </w:t>
+      </w:r>
+      <w:r>
+        <w:t>set</w:t>
+      </w:r>
+      <w:r>
+        <w:t>A</w:t>
+      </w:r>
+      <w:r>
+        <w:t>[</w:t>
+      </w:r>
+      <w:r>
+        <w:t>3</w:t>
+      </w:r>
+      <w:r>
+        <w:t>][i]</w:t>
+      </w:r>
+      <w:r>
+        <w:t xml:space="preserve"> không thỏa mãn minSupport</w:t>
       </w:r>
     </w:p>
     <w:p/>
     <w:p>
-      <w:r>
-        <w:t xml:space="preserve">Sinh các tập hợp N phần tử = </w:t>
-      </w:r>
-      <w:r>
-        <w:t>[“</w:t>
-      </w:r>
-      <w:r>
-        <w:t>setA</w:t>
-      </w:r>
-      <w:r>
-        <w:t xml:space="preserve">”+ </w:t>
-      </w:r>
-      <w:r>
-        <w:t>N</w:t>
-      </w:r>
-      <w:r>
-        <w:t>]</w:t>
-      </w:r>
-      <w:r>
-        <w:t xml:space="preserve"> từ các </w:t>
-      </w:r>
-      <w:r>
-        <w:t>[“setA”+(N-1)]</w:t>
+      <w:pPr>
+        <w:jc w:val="left"/>
+      </w:pPr>
+      <w:r>
+        <w:br w:type="page"/>
       </w:r>
     </w:p>
     <w:p>
       <w:r>
-        <w:t>(Sinh bằng cách hợp các phần tử)</w:t>
+        <w:lastRenderedPageBreak/>
+        <w:t xml:space="preserve">Dùng Apriori gen, </w:t>
+      </w:r>
+      <w:r>
+        <w:t xml:space="preserve">Sinh các tập hợp </w:t>
+      </w:r>
+      <w:r>
+        <w:t>4</w:t>
+      </w:r>
+      <w:r>
+        <w:t xml:space="preserve"> phần tử = setA[</w:t>
+      </w:r>
+      <w:r>
+        <w:t>4</w:t>
+      </w:r>
+      <w:r>
+        <w:t>] từ setA[</w:t>
+      </w:r>
+      <w:r>
+        <w:t>3</w:t>
+      </w:r>
+      <w:r>
+        <w:t>] đã loại bỏ</w:t>
       </w:r>
     </w:p>
     <w:p>
       <w:r>
-        <w:t>Loại bỏ các [“A” + N] không thỏa mãn minSupport</w:t>
+        <w:t xml:space="preserve">(Sinh bằng cách </w:t>
       </w:r>
     </w:p>
+    <w:p>
+      <w:pPr>
+        <w:pStyle w:val="oancuaDanhsach"/>
+        <w:numPr>
+          <w:ilvl w:val="0"/>
+          <w:numId w:val="21"/>
+        </w:numPr>
+      </w:pPr>
+      <w:r>
+        <w:t xml:space="preserve">Chọn các phần tử </w:t>
+      </w:r>
+      <w:r>
+        <w:t>3</w:t>
+      </w:r>
+      <w:r>
+        <w:t xml:space="preserve"> phần tử có chung </w:t>
+      </w:r>
+      <w:r>
+        <w:t>2</w:t>
+      </w:r>
+      <w:r>
+        <w:t xml:space="preserve"> phần tử</w:t>
+      </w:r>
+    </w:p>
+    <w:p>
+      <w:pPr>
+        <w:pStyle w:val="oancuaDanhsach"/>
+        <w:numPr>
+          <w:ilvl w:val="0"/>
+          <w:numId w:val="21"/>
+        </w:numPr>
+      </w:pPr>
+      <w:r>
+        <w:t>hợp các phần tử)</w:t>
+      </w:r>
+    </w:p>
+    <w:p>
+      <w:r>
+        <w:t xml:space="preserve">Loại các </w:t>
+      </w:r>
+      <w:r>
+        <w:t>set</w:t>
+      </w:r>
+      <w:r>
+        <w:t>A</w:t>
+      </w:r>
+      <w:r>
+        <w:t>[</w:t>
+      </w:r>
+      <w:r>
+        <w:t>4</w:t>
+      </w:r>
+      <w:r>
+        <w:t>][i]</w:t>
+      </w:r>
+      <w:r>
+        <w:t xml:space="preserve"> không thỏa mãn minSupport</w:t>
+      </w:r>
+    </w:p>
+    <w:p/>
+    <w:p>
+      <w:r>
+        <w:t>…</w:t>
+      </w:r>
+    </w:p>
+    <w:p/>
+    <w:p>
+      <w:pPr>
+        <w:jc w:val="left"/>
+      </w:pPr>
+      <w:r>
+        <w:br w:type="page"/>
+      </w:r>
+    </w:p>
+    <w:p>
+      <w:r>
+        <w:lastRenderedPageBreak/>
+        <w:t xml:space="preserve">Dùng Apriori gen, </w:t>
+      </w:r>
+      <w:r>
+        <w:t xml:space="preserve">Sinh các tập hợp </w:t>
+      </w:r>
+      <w:r>
+        <w:t>N</w:t>
+      </w:r>
+      <w:r>
+        <w:t xml:space="preserve"> phần tử = setA[</w:t>
+      </w:r>
+      <w:r>
+        <w:t>N</w:t>
+      </w:r>
+      <w:r>
+        <w:t>] từ setA[</w:t>
+      </w:r>
+      <w:r>
+        <w:t>N-1</w:t>
+      </w:r>
+      <w:r>
+        <w:t>] đã loại bỏ</w:t>
+      </w:r>
+    </w:p>
+    <w:p>
+      <w:r>
+        <w:t xml:space="preserve">(Sinh bằng cách </w:t>
+      </w:r>
+    </w:p>
+    <w:p>
+      <w:pPr>
+        <w:pStyle w:val="oancuaDanhsach"/>
+        <w:numPr>
+          <w:ilvl w:val="0"/>
+          <w:numId w:val="21"/>
+        </w:numPr>
+      </w:pPr>
+      <w:r>
+        <w:t xml:space="preserve">Chọn các phần tử </w:t>
+      </w:r>
+      <w:r>
+        <w:t>(N-1)</w:t>
+      </w:r>
+      <w:r>
+        <w:t xml:space="preserve"> phần tử có chung </w:t>
+      </w:r>
+      <w:r>
+        <w:t>(N-2)</w:t>
+      </w:r>
+      <w:r>
+        <w:t xml:space="preserve"> phần tử</w:t>
+      </w:r>
+    </w:p>
+    <w:p>
+      <w:pPr>
+        <w:pStyle w:val="oancuaDanhsach"/>
+        <w:numPr>
+          <w:ilvl w:val="0"/>
+          <w:numId w:val="21"/>
+        </w:numPr>
+      </w:pPr>
+      <w:r>
+        <w:t>hợp các phần tử)</w:t>
+      </w:r>
+    </w:p>
+    <w:p>
+      <w:r>
+        <w:t xml:space="preserve">Loại các </w:t>
+      </w:r>
+      <w:r>
+        <w:t>setA[N][i]</w:t>
+      </w:r>
+      <w:r>
+        <w:t xml:space="preserve"> không thỏa mãn minSupport</w:t>
+      </w:r>
+    </w:p>
+    <w:p/>
     <w:sectPr>
       <w:footerReference w:type="default" r:id="rId9"/>
       <w:pgSz w:w="12240" w:h="15840"/>
@@ -931,6 +1413,119 @@
     </w:lvl>
   </w:abstractNum>
   <w:abstractNum w:abstractNumId="6" w15:restartNumberingAfterBreak="0">
+    <w:nsid w:val="3BEC0C91"/>
+    <w:multiLevelType w:val="hybridMultilevel"/>
+    <w:tmpl w:val="3C8E9ED8"/>
+    <w:lvl w:ilvl="0" w:tplc="877664C4">
+      <w:start w:val="4"/>
+      <w:numFmt w:val="bullet"/>
+      <w:lvlText w:val=""/>
+      <w:lvlJc w:val="left"/>
+      <w:pPr>
+        <w:ind w:left="720" w:hanging="360"/>
+      </w:pPr>
+      <w:rPr>
+        <w:rFonts w:ascii="Symbol" w:eastAsiaTheme="minorHAnsi" w:hAnsi="Symbol" w:cstheme="minorBidi" w:hint="default"/>
+      </w:rPr>
+    </w:lvl>
+    <w:lvl w:ilvl="1" w:tplc="042A0003" w:tentative="1">
+      <w:start w:val="1"/>
+      <w:numFmt w:val="bullet"/>
+      <w:lvlText w:val="o"/>
+      <w:lvlJc w:val="left"/>
+      <w:pPr>
+        <w:ind w:left="1440" w:hanging="360"/>
+      </w:pPr>
+      <w:rPr>
+        <w:rFonts w:ascii="Courier New" w:hAnsi="Courier New" w:cs="Courier New" w:hint="default"/>
+      </w:rPr>
+    </w:lvl>
+    <w:lvl w:ilvl="2" w:tplc="042A0005" w:tentative="1">
+      <w:start w:val="1"/>
+      <w:numFmt w:val="bullet"/>
+      <w:lvlText w:val=""/>
+      <w:lvlJc w:val="left"/>
+      <w:pPr>
+        <w:ind w:left="2160" w:hanging="360"/>
+      </w:pPr>
+      <w:rPr>
+        <w:rFonts w:ascii="Wingdings" w:hAnsi="Wingdings" w:hint="default"/>
+      </w:rPr>
+    </w:lvl>
+    <w:lvl w:ilvl="3" w:tplc="042A0001" w:tentative="1">
+      <w:start w:val="1"/>
+      <w:numFmt w:val="bullet"/>
+      <w:lvlText w:val=""/>
+      <w:lvlJc w:val="left"/>
+      <w:pPr>
+        <w:ind w:left="2880" w:hanging="360"/>
+      </w:pPr>
+      <w:rPr>
+        <w:rFonts w:ascii="Symbol" w:hAnsi="Symbol" w:hint="default"/>
+      </w:rPr>
+    </w:lvl>
+    <w:lvl w:ilvl="4" w:tplc="042A0003" w:tentative="1">
+      <w:start w:val="1"/>
+      <w:numFmt w:val="bullet"/>
+      <w:lvlText w:val="o"/>
+      <w:lvlJc w:val="left"/>
+      <w:pPr>
+        <w:ind w:left="3600" w:hanging="360"/>
+      </w:pPr>
+      <w:rPr>
+        <w:rFonts w:ascii="Courier New" w:hAnsi="Courier New" w:cs="Courier New" w:hint="default"/>
+      </w:rPr>
+    </w:lvl>
+    <w:lvl w:ilvl="5" w:tplc="042A0005" w:tentative="1">
+      <w:start w:val="1"/>
+      <w:numFmt w:val="bullet"/>
+      <w:lvlText w:val=""/>
+      <w:lvlJc w:val="left"/>
+      <w:pPr>
+        <w:ind w:left="4320" w:hanging="360"/>
+      </w:pPr>
+      <w:rPr>
+        <w:rFonts w:ascii="Wingdings" w:hAnsi="Wingdings" w:hint="default"/>
+      </w:rPr>
+    </w:lvl>
+    <w:lvl w:ilvl="6" w:tplc="042A0001" w:tentative="1">
+      <w:start w:val="1"/>
+      <w:numFmt w:val="bullet"/>
+      <w:lvlText w:val=""/>
+      <w:lvlJc w:val="left"/>
+      <w:pPr>
+        <w:ind w:left="5040" w:hanging="360"/>
+      </w:pPr>
+      <w:rPr>
+        <w:rFonts w:ascii="Symbol" w:hAnsi="Symbol" w:hint="default"/>
+      </w:rPr>
+    </w:lvl>
+    <w:lvl w:ilvl="7" w:tplc="042A0003" w:tentative="1">
+      <w:start w:val="1"/>
+      <w:numFmt w:val="bullet"/>
+      <w:lvlText w:val="o"/>
+      <w:lvlJc w:val="left"/>
+      <w:pPr>
+        <w:ind w:left="5760" w:hanging="360"/>
+      </w:pPr>
+      <w:rPr>
+        <w:rFonts w:ascii="Courier New" w:hAnsi="Courier New" w:cs="Courier New" w:hint="default"/>
+      </w:rPr>
+    </w:lvl>
+    <w:lvl w:ilvl="8" w:tplc="042A0005" w:tentative="1">
+      <w:start w:val="1"/>
+      <w:numFmt w:val="bullet"/>
+      <w:lvlText w:val=""/>
+      <w:lvlJc w:val="left"/>
+      <w:pPr>
+        <w:ind w:left="6480" w:hanging="360"/>
+      </w:pPr>
+      <w:rPr>
+        <w:rFonts w:ascii="Wingdings" w:hAnsi="Wingdings" w:hint="default"/>
+      </w:rPr>
+    </w:lvl>
+  </w:abstractNum>
+  <w:abstractNum w:abstractNumId="7" w15:restartNumberingAfterBreak="0">
     <w:nsid w:val="43141ED9"/>
     <w:multiLevelType w:val="hybridMultilevel"/>
     <w:tmpl w:val="5884475C"/>
@@ -1043,7 +1638,7 @@
       </w:rPr>
     </w:lvl>
   </w:abstractNum>
-  <w:abstractNum w:abstractNumId="7" w15:restartNumberingAfterBreak="0">
+  <w:abstractNum w:abstractNumId="8" w15:restartNumberingAfterBreak="0">
     <w:nsid w:val="55AD0EFA"/>
     <w:multiLevelType w:val="multilevel"/>
     <w:tmpl w:val="E8D4BC04"/>
@@ -1174,7 +1769,7 @@
       </w:rPr>
     </w:lvl>
   </w:abstractNum>
-  <w:abstractNum w:abstractNumId="8" w15:restartNumberingAfterBreak="0">
+  <w:abstractNum w:abstractNumId="9" w15:restartNumberingAfterBreak="0">
     <w:nsid w:val="560954A9"/>
     <w:multiLevelType w:val="hybridMultilevel"/>
     <w:tmpl w:val="51E63EF4"/>
@@ -1286,7 +1881,156 @@
       </w:rPr>
     </w:lvl>
   </w:abstractNum>
-  <w:abstractNum w:abstractNumId="9" w15:restartNumberingAfterBreak="0">
+  <w:abstractNum w:abstractNumId="10" w15:restartNumberingAfterBreak="0">
+    <w:nsid w:val="5BC725AC"/>
+    <w:multiLevelType w:val="multilevel"/>
+    <w:tmpl w:val="CC683A28"/>
+    <w:lvl w:ilvl="0">
+      <w:start w:val="1"/>
+      <w:numFmt w:val="bullet"/>
+      <w:lvlText w:val=""/>
+      <w:lvlJc w:val="left"/>
+      <w:pPr>
+        <w:tabs>
+          <w:tab w:val="num" w:pos="720"/>
+        </w:tabs>
+        <w:ind w:left="720" w:hanging="360"/>
+      </w:pPr>
+      <w:rPr>
+        <w:rFonts w:ascii="Symbol" w:hAnsi="Symbol" w:hint="default"/>
+        <w:sz w:val="20"/>
+      </w:rPr>
+    </w:lvl>
+    <w:lvl w:ilvl="1" w:tentative="1">
+      <w:start w:val="1"/>
+      <w:numFmt w:val="bullet"/>
+      <w:lvlText w:val="o"/>
+      <w:lvlJc w:val="left"/>
+      <w:pPr>
+        <w:tabs>
+          <w:tab w:val="num" w:pos="1440"/>
+        </w:tabs>
+        <w:ind w:left="1440" w:hanging="360"/>
+      </w:pPr>
+      <w:rPr>
+        <w:rFonts w:ascii="Courier New" w:hAnsi="Courier New" w:hint="default"/>
+        <w:sz w:val="20"/>
+      </w:rPr>
+    </w:lvl>
+    <w:lvl w:ilvl="2" w:tentative="1">
+      <w:start w:val="1"/>
+      <w:numFmt w:val="bullet"/>
+      <w:lvlText w:val=""/>
+      <w:lvlJc w:val="left"/>
+      <w:pPr>
+        <w:tabs>
+          <w:tab w:val="num" w:pos="2160"/>
+        </w:tabs>
+        <w:ind w:left="2160" w:hanging="360"/>
+      </w:pPr>
+      <w:rPr>
+        <w:rFonts w:ascii="Wingdings" w:hAnsi="Wingdings" w:hint="default"/>
+        <w:sz w:val="20"/>
+      </w:rPr>
+    </w:lvl>
+    <w:lvl w:ilvl="3" w:tentative="1">
+      <w:start w:val="1"/>
+      <w:numFmt w:val="bullet"/>
+      <w:lvlText w:val=""/>
+      <w:lvlJc w:val="left"/>
+      <w:pPr>
+        <w:tabs>
+          <w:tab w:val="num" w:pos="2880"/>
+        </w:tabs>
+        <w:ind w:left="2880" w:hanging="360"/>
+      </w:pPr>
+      <w:rPr>
+        <w:rFonts w:ascii="Wingdings" w:hAnsi="Wingdings" w:hint="default"/>
+        <w:sz w:val="20"/>
+      </w:rPr>
+    </w:lvl>
+    <w:lvl w:ilvl="4" w:tentative="1">
+      <w:start w:val="1"/>
+      <w:numFmt w:val="bullet"/>
+      <w:lvlText w:val=""/>
+      <w:lvlJc w:val="left"/>
+      <w:pPr>
+        <w:tabs>
+          <w:tab w:val="num" w:pos="3600"/>
+        </w:tabs>
+        <w:ind w:left="3600" w:hanging="360"/>
+      </w:pPr>
+      <w:rPr>
+        <w:rFonts w:ascii="Wingdings" w:hAnsi="Wingdings" w:hint="default"/>
+        <w:sz w:val="20"/>
+      </w:rPr>
+    </w:lvl>
+    <w:lvl w:ilvl="5" w:tentative="1">
+      <w:start w:val="1"/>
+      <w:numFmt w:val="bullet"/>
+      <w:lvlText w:val=""/>
+      <w:lvlJc w:val="left"/>
+      <w:pPr>
+        <w:tabs>
+          <w:tab w:val="num" w:pos="4320"/>
+        </w:tabs>
+        <w:ind w:left="4320" w:hanging="360"/>
+      </w:pPr>
+      <w:rPr>
+        <w:rFonts w:ascii="Wingdings" w:hAnsi="Wingdings" w:hint="default"/>
+        <w:sz w:val="20"/>
+      </w:rPr>
+    </w:lvl>
+    <w:lvl w:ilvl="6" w:tentative="1">
+      <w:start w:val="1"/>
+      <w:numFmt w:val="bullet"/>
+      <w:lvlText w:val=""/>
+      <w:lvlJc w:val="left"/>
+      <w:pPr>
+        <w:tabs>
+          <w:tab w:val="num" w:pos="5040"/>
+        </w:tabs>
+        <w:ind w:left="5040" w:hanging="360"/>
+      </w:pPr>
+      <w:rPr>
+        <w:rFonts w:ascii="Wingdings" w:hAnsi="Wingdings" w:hint="default"/>
+        <w:sz w:val="20"/>
+      </w:rPr>
+    </w:lvl>
+    <w:lvl w:ilvl="7" w:tentative="1">
+      <w:start w:val="1"/>
+      <w:numFmt w:val="bullet"/>
+      <w:lvlText w:val=""/>
+      <w:lvlJc w:val="left"/>
+      <w:pPr>
+        <w:tabs>
+          <w:tab w:val="num" w:pos="5760"/>
+        </w:tabs>
+        <w:ind w:left="5760" w:hanging="360"/>
+      </w:pPr>
+      <w:rPr>
+        <w:rFonts w:ascii="Wingdings" w:hAnsi="Wingdings" w:hint="default"/>
+        <w:sz w:val="20"/>
+      </w:rPr>
+    </w:lvl>
+    <w:lvl w:ilvl="8" w:tentative="1">
+      <w:start w:val="1"/>
+      <w:numFmt w:val="bullet"/>
+      <w:lvlText w:val=""/>
+      <w:lvlJc w:val="left"/>
+      <w:pPr>
+        <w:tabs>
+          <w:tab w:val="num" w:pos="6480"/>
+        </w:tabs>
+        <w:ind w:left="6480" w:hanging="360"/>
+      </w:pPr>
+      <w:rPr>
+        <w:rFonts w:ascii="Wingdings" w:hAnsi="Wingdings" w:hint="default"/>
+        <w:sz w:val="20"/>
+      </w:rPr>
+    </w:lvl>
+  </w:abstractNum>
+  <w:abstractNum w:abstractNumId="11" w15:restartNumberingAfterBreak="0">
     <w:nsid w:val="5C7B2782"/>
     <w:multiLevelType w:val="hybridMultilevel"/>
     <w:tmpl w:val="A3FC8EE4"/>
@@ -1399,19 +2143,19 @@
     </w:lvl>
   </w:abstractNum>
   <w:num w:numId="1" w16cid:durableId="899438409">
-    <w:abstractNumId w:val="6"/>
+    <w:abstractNumId w:val="7"/>
   </w:num>
   <w:num w:numId="2" w16cid:durableId="2069496555">
-    <w:abstractNumId w:val="8"/>
+    <w:abstractNumId w:val="9"/>
   </w:num>
   <w:num w:numId="3" w16cid:durableId="697006483">
-    <w:abstractNumId w:val="9"/>
+    <w:abstractNumId w:val="11"/>
   </w:num>
   <w:num w:numId="4" w16cid:durableId="1899899883">
     <w:abstractNumId w:val="2"/>
   </w:num>
   <w:num w:numId="5" w16cid:durableId="376467483">
-    <w:abstractNumId w:val="7"/>
+    <w:abstractNumId w:val="8"/>
   </w:num>
   <w:num w:numId="6" w16cid:durableId="82993838">
     <w:abstractNumId w:val="4"/>
@@ -1423,31 +2167,31 @@
     <w:abstractNumId w:val="1"/>
   </w:num>
   <w:num w:numId="9" w16cid:durableId="1747336329">
-    <w:abstractNumId w:val="7"/>
+    <w:abstractNumId w:val="8"/>
   </w:num>
   <w:num w:numId="10" w16cid:durableId="615331068">
-    <w:abstractNumId w:val="7"/>
+    <w:abstractNumId w:val="8"/>
   </w:num>
   <w:num w:numId="11" w16cid:durableId="1058744671">
-    <w:abstractNumId w:val="7"/>
+    <w:abstractNumId w:val="8"/>
   </w:num>
   <w:num w:numId="12" w16cid:durableId="218445401">
-    <w:abstractNumId w:val="7"/>
+    <w:abstractNumId w:val="8"/>
   </w:num>
   <w:num w:numId="13" w16cid:durableId="1024867668">
-    <w:abstractNumId w:val="7"/>
+    <w:abstractNumId w:val="8"/>
   </w:num>
   <w:num w:numId="14" w16cid:durableId="397754867">
-    <w:abstractNumId w:val="7"/>
+    <w:abstractNumId w:val="8"/>
   </w:num>
   <w:num w:numId="15" w16cid:durableId="575407862">
-    <w:abstractNumId w:val="7"/>
+    <w:abstractNumId w:val="8"/>
   </w:num>
   <w:num w:numId="16" w16cid:durableId="1199584663">
-    <w:abstractNumId w:val="7"/>
+    <w:abstractNumId w:val="8"/>
   </w:num>
   <w:num w:numId="17" w16cid:durableId="2113626174">
-    <w:abstractNumId w:val="7"/>
+    <w:abstractNumId w:val="8"/>
   </w:num>
   <w:num w:numId="18" w16cid:durableId="1801336036">
     <w:abstractNumId w:val="5"/>
@@ -1457,6 +2201,12 @@
   </w:num>
   <w:num w:numId="20" w16cid:durableId="1329014923">
     <w:abstractNumId w:val="3"/>
+  </w:num>
+  <w:num w:numId="21" w16cid:durableId="791706013">
+    <w:abstractNumId w:val="6"/>
+  </w:num>
+  <w:num w:numId="22" w16cid:durableId="1155992194">
+    <w:abstractNumId w:val="10"/>
   </w:num>
 </w:numbering>
 </file>
@@ -1861,7 +2611,7 @@
   <w:style w:type="paragraph" w:default="1" w:styleId="Binhthng">
     <w:name w:val="Normal"/>
     <w:qFormat/>
-    <w:rsid w:val="00C41BD9"/>
+    <w:rsid w:val="00044072"/>
     <w:pPr>
       <w:jc w:val="both"/>
     </w:pPr>
@@ -2108,7 +2858,6 @@
   <w:style w:type="character" w:default="1" w:styleId="Phngmcinhcuaoanvn">
     <w:name w:val="Default Paragraph Font"/>
     <w:uiPriority w:val="1"/>
-    <w:semiHidden/>
     <w:unhideWhenUsed/>
   </w:style>
   <w:style w:type="table" w:default="1" w:styleId="BangThngthng">

</xml_diff>